<commit_message>
fix: resolve theme switcher, consolidate chapter finder, fix sequential PYQ numbering, dynamic KCET year filter, and authentic KCET taxonomies
</commit_message>
<xml_diff>
--- a/data/exports/kcet-alcohol-phenols-and-ethers_revision_notes.docx
+++ b/data/exports/kcet-alcohol-phenols-and-ethers_revision_notes.docx
@@ -164,10 +164,10 @@
             <w:r>
               <w:rPr>
                 <w:b/>
-                <w:color w:val="C53030"/>
+                <w:color w:val="2B6CB0"/>
                 <w:sz w:val="19"/>
               </w:rPr>
-              <w:t>Very High</w:t>
+              <w:t>High</w:t>
             </w:r>
           </w:p>
         </w:tc>
@@ -189,7 +189,7 @@
                 <w:color w:val="2D3748"/>
                 <w:sz w:val="19"/>
               </w:rPr>
-              <w:t>Williamson Ether Synthesis &amp; Cleavage by HI</w:t>
+              <w:t>Ethers: Williamson Synthesis &amp; Cleavage with HI</w:t>
             </w:r>
           </w:p>
         </w:tc>
@@ -209,7 +209,7 @@
               <w:rPr>
                 <w:sz w:val="19"/>
               </w:rPr>
-              <w:t>17 PYQs</w:t>
+              <w:t>14 PYQs</w:t>
             </w:r>
           </w:p>
         </w:tc>
@@ -251,10 +251,10 @@
             <w:r>
               <w:rPr>
                 <w:b/>
-                <w:color w:val="C53030"/>
+                <w:color w:val="2B6CB0"/>
                 <w:sz w:val="19"/>
               </w:rPr>
-              <w:t>Very High</w:t>
+              <w:t>High</w:t>
             </w:r>
           </w:p>
         </w:tc>
@@ -276,7 +276,7 @@
                 <w:color w:val="2D3748"/>
                 <w:sz w:val="19"/>
               </w:rPr>
-              <w:t>Acidity of Phenols &amp; Distinguishing Tests</w:t>
+              <w:t>Phenols: Acidity &amp; Named Reactions (Kolbe &amp; Reimer-Tiemann)</w:t>
             </w:r>
           </w:p>
         </w:tc>
@@ -296,7 +296,7 @@
               <w:rPr>
                 <w:sz w:val="19"/>
               </w:rPr>
-              <w:t>15 PYQs</w:t>
+              <w:t>13 PYQs</w:t>
             </w:r>
           </w:p>
         </w:tc>
@@ -318,6 +318,93 @@
                 <w:sz w:val="19"/>
               </w:rPr>
               <w:t>Phenols</w:t>
+            </w:r>
+          </w:p>
+        </w:tc>
+      </w:tr>
+      <w:tr>
+        <w:tc>
+          <w:tcPr>
+            <w:tcW w:type="dxa" w:w="2160"/>
+            <w:shd w:fill="F7FAFC"/>
+            <w:tcMar>
+              <w:top w:w="80" w:type="dxa"/>
+              <w:bottom w:w="80" w:type="dxa"/>
+              <w:left w:w="150" w:type="dxa"/>
+              <w:right w:w="150" w:type="dxa"/>
+            </w:tcMar>
+          </w:tcPr>
+          <w:p>
+            <w:r>
+              <w:rPr>
+                <w:b/>
+                <w:color w:val="718096"/>
+                <w:sz w:val="19"/>
+              </w:rPr>
+              <w:t>Moderate</w:t>
+            </w:r>
+          </w:p>
+        </w:tc>
+        <w:tc>
+          <w:tcPr>
+            <w:tcW w:type="dxa" w:w="4320"/>
+            <w:shd w:fill="F7FAFC"/>
+            <w:tcMar>
+              <w:top w:w="80" w:type="dxa"/>
+              <w:bottom w:w="80" w:type="dxa"/>
+              <w:left w:w="150" w:type="dxa"/>
+              <w:right w:w="150" w:type="dxa"/>
+            </w:tcMar>
+          </w:tcPr>
+          <w:p>
+            <w:r>
+              <w:rPr>
+                <w:b/>
+                <w:color w:val="2D3748"/>
+                <w:sz w:val="19"/>
+              </w:rPr>
+              <w:t>Alcohols: Preparation, Lucas Test &amp; Dehydration</w:t>
+            </w:r>
+          </w:p>
+        </w:tc>
+        <w:tc>
+          <w:tcPr>
+            <w:tcW w:type="dxa" w:w="1728"/>
+            <w:shd w:fill="F7FAFC"/>
+            <w:tcMar>
+              <w:top w:w="80" w:type="dxa"/>
+              <w:bottom w:w="80" w:type="dxa"/>
+              <w:left w:w="150" w:type="dxa"/>
+              <w:right w:w="150" w:type="dxa"/>
+            </w:tcMar>
+          </w:tcPr>
+          <w:p>
+            <w:r>
+              <w:rPr>
+                <w:sz w:val="19"/>
+              </w:rPr>
+              <w:t>5 PYQs</w:t>
+            </w:r>
+          </w:p>
+        </w:tc>
+        <w:tc>
+          <w:tcPr>
+            <w:tcW w:type="dxa" w:w="1872"/>
+            <w:shd w:fill="F7FAFC"/>
+            <w:tcMar>
+              <w:top w:w="80" w:type="dxa"/>
+              <w:bottom w:w="80" w:type="dxa"/>
+              <w:left w:w="150" w:type="dxa"/>
+              <w:right w:w="150" w:type="dxa"/>
+            </w:tcMar>
+          </w:tcPr>
+          <w:p>
+            <w:r>
+              <w:rPr>
+                <w:color w:val="718096"/>
+                <w:sz w:val="19"/>
+              </w:rPr>
+              <w:t>Alcohols</w:t>
             </w:r>
           </w:p>
         </w:tc>
@@ -417,7 +504,7 @@
                 <w:color w:val="1A365D"/>
                 <w:sz w:val="19"/>
               </w:rPr>
-              <w:t>Williamson Ether Synthesis &amp; Cleavage by HI</w:t>
+              <w:t>Ethers: Williamson Synthesis &amp; Cleavage with HI</w:t>
             </w:r>
           </w:p>
         </w:tc>
@@ -439,7 +526,7 @@
                 <w:color w:val="2D3748"/>
                 <w:sz w:val="19"/>
               </w:rPr>
-              <w:t>\text{Williamson: } \text{R-O}^- \text{Na}^+ + \text{R'-X (must be } 1^\circ) \to \text{R-O-R'} + \text{NaX}</w:t>
+              <w:t>\text{Williamson: } \text{R-O}^-\text{Na}^+ + \text{R'-X} (1^\\circ) \xrightarrow{S_N2} \text{R-O-R'}, \quad \text{Cleavage of Anisole}: \text{C}_6\text{H}_5\text{OCH}_3 + \text{HI} \to \text{C}_6\text{H}_5\text{OH} + \text{CH}_3\text{I}</w:t>
             </w:r>
           </w:p>
         </w:tc>
@@ -463,7 +550,7 @@
                 <w:color w:val="1A365D"/>
                 <w:sz w:val="19"/>
               </w:rPr>
-              <w:t>Acidity of Phenols &amp; Distinguishing Tests</w:t>
+              <w:t>Phenols: Acidity &amp; Named Reactions (Kolbe &amp; Reimer-Tiemann)</w:t>
             </w:r>
           </w:p>
         </w:tc>
@@ -485,7 +572,53 @@
                 <w:color w:val="2D3748"/>
                 <w:sz w:val="19"/>
               </w:rPr>
-              <w:t>\text{Acidity: Picric acid} &gt; \text{p-Nitrophenol} &gt; \text{Phenol} &gt; \text{Water} &gt; \text{Ethanol}, \quad \text{Lucas: } 3^\circ \text{ (turbidity immediately)}, 2^\circ \text{ (5 mins)}, 1^\circ \text{ (no turbidity)}</w:t>
+              <w:t>\text{Kolbe: } \text{C}_6\text{H}_5\text{ONa} + \text{CO}_2 \xrightarrow{400\text{K}, 4-7\text{atm}} \text{Salicylic Acid}, \quad \text{Reimer-Tiemann: } \text{Phenol} + \text{CHCl}_3/\text{NaOH} \to \text{Salicylaldehyde}</w:t>
+            </w:r>
+          </w:p>
+        </w:tc>
+      </w:tr>
+      <w:tr>
+        <w:tc>
+          <w:tcPr>
+            <w:tcW w:type="dxa" w:w="3600"/>
+            <w:shd w:fill="F7FAFC"/>
+            <w:tcMar>
+              <w:top w:w="100" w:type="dxa"/>
+              <w:bottom w:w="100" w:type="dxa"/>
+              <w:left w:w="150" w:type="dxa"/>
+              <w:right w:w="150" w:type="dxa"/>
+            </w:tcMar>
+          </w:tcPr>
+          <w:p>
+            <w:r>
+              <w:rPr>
+                <w:b/>
+                <w:color w:val="1A365D"/>
+                <w:sz w:val="19"/>
+              </w:rPr>
+              <w:t>Alcohols: Preparation, Lucas Test &amp; Dehydration</w:t>
+            </w:r>
+          </w:p>
+        </w:tc>
+        <w:tc>
+          <w:tcPr>
+            <w:tcW w:type="dxa" w:w="6480"/>
+            <w:shd w:fill="F7FAFC"/>
+            <w:tcMar>
+              <w:top w:w="100" w:type="dxa"/>
+              <w:bottom w:w="100" w:type="dxa"/>
+              <w:left w:w="150" w:type="dxa"/>
+              <w:right w:w="150" w:type="dxa"/>
+            </w:tcMar>
+          </w:tcPr>
+          <w:p>
+            <w:r>
+              <w:rPr>
+                <w:rFonts w:ascii="Cambria Math" w:hAnsi="Cambria Math"/>
+                <w:color w:val="2D3748"/>
+                <w:sz w:val="19"/>
+              </w:rPr>
+              <w:t>\text{Lucas: } 3^\\circ \to \text{Immediate}, \quad 2^\\circ \to 5\text{ mins}, \quad 1^\\circ \to \text{No turbidity at room temp}</w:t>
             </w:r>
           </w:p>
         </w:tc>
@@ -517,7 +650,7 @@
           <w:color w:val="2B6CB0"/>
           <w:sz w:val="24"/>
         </w:rPr>
-        <w:t>3.1 Williamson Ether Synthesis &amp; Cleavage by HI (Very High Yield — 17 PYQs)</w:t>
+        <w:t>3.1 Ethers: Williamson Synthesis &amp; Cleavage with HI (High Yield — 14 PYQs)</w:t>
       </w:r>
     </w:p>
     <w:p>
@@ -532,7 +665,7 @@
         <w:rPr>
           <w:sz w:val="20"/>
         </w:rPr>
-        <w:t>Alkoxide SN2 displacement on primary halides, and ether cleavage mechanism with concentrated HI.</w:t>
+        <w:t>Williamson Synthesis: Reaction of sodium alkoxide with 1° alkyl halide via S_N2 mechanism. Cleavage with concentrated HI: With unsymmetrical ethers containing 1° and 2° alkyl groups, the smaller alkyl group forms alkyl iodide via S_N2. If one alkyl group is 3° (e.g. tert-butyl methyl ether), the 3° group forms the iodide via S_N1 carbocation mechanism!</w:t>
       </w:r>
     </w:p>
     <w:tbl>
@@ -570,7 +703,7 @@
                 <w:color w:val="2D3748"/>
                 <w:sz w:val="19"/>
               </w:rPr>
-              <w:t>In Williamson synthesis, the alkyl halide MUST be primary (1°). If a tertiary (3°) halide is used, elimination dominates to give an ALKENE instead of an ether!</w:t>
+              <w:t>In Williamson synthesis, using a 3° alkyl halide with sodium alkoxide yields an ALKENE via elimination, NOT an ether!</w:t>
             </w:r>
           </w:p>
         </w:tc>
@@ -611,7 +744,7 @@
                 <w:color w:val="2D3748"/>
                 <w:sz w:val="19"/>
               </w:rPr>
-              <w:t>With unsymmetrical ethers + HI: If one alkyl group is tertiary (3°), the iodide attaches to the 3° carbon (via SN1). If both are 1° or 2°, iodide attacks the less hindered carbon (via SN2).</w:t>
+              <w:t>Cleavage of anisole (extC_6 extH_5 extOCH_3) with HI always yields Phenol and Methyl Iodide because C_6H_5-O partial double bond cannot be broken.</w:t>
             </w:r>
           </w:p>
         </w:tc>
@@ -694,13 +827,13 @@
           <w:b/>
           <w:sz w:val="18"/>
         </w:rPr>
-        <w:t xml:space="preserve">[2026 Shift] Q#3 (MCQ): </w:t>
+        <w:t xml:space="preserve">[2025 Shift] Q#1 (MCQ): </w:t>
       </w:r>
       <w:r>
         <w:rPr>
           <w:sz w:val="18"/>
         </w:rPr>
-        <w:t xml:space="preserve">"R-CH_(2)OH is converted into R-CHO by reacting with ________...."  </w:t>
+        <w:t xml:space="preserve">"Ethyl alcohol is heated with concentrated sulphuric acid at 413 K . The major product..."  </w:t>
       </w:r>
       <w:r>
         <w:rPr>
@@ -725,7 +858,7 @@
           <w:color w:val="2B6CB0"/>
           <w:sz w:val="24"/>
         </w:rPr>
-        <w:t>3.2 Acidity of Phenols &amp; Distinguishing Tests (Very High Yield — 15 PYQs)</w:t>
+        <w:t>3.2 Phenols: Acidity &amp; Named Reactions (Kolbe &amp; Reimer-Tiemann) (High Yield — 13 PYQs)</w:t>
       </w:r>
     </w:p>
     <w:p>
@@ -740,7 +873,7 @@
         <w:rPr>
           <w:sz w:val="20"/>
         </w:rPr>
-        <w:t>Phenoxide resonance stabilization, substituent effects on acidity, Reimer-Tiemann and Kolbe-Schmitt reactions, and Lucas test.</w:t>
+        <w:t>Phenol is acidic (pK_a ≈ 10) because phenoxide ion is resonance stabilized. Electron withdrawing groups (e.g. -NO_2) increase acidity; picric acid (2,4,6-trinitrophenol) is strongly acidic (pK_a = 0.38). Kolbe's reaction: Sodium phenoxide with CO_2 at 400 K and 4-7 atm gives salicylic acid (precursor to aspirin). Reimer-Tiemann reaction: Phenol with CHCl_3 + aq. NaOH generates dichlorocarbene electrophile (:CCl_2) to yield salicylaldehyde.</w:t>
       </w:r>
     </w:p>
     <w:tbl>
@@ -778,7 +911,7 @@
                 <w:color w:val="2D3748"/>
                 <w:sz w:val="19"/>
               </w:rPr>
-              <w:t>Electron withdrawing groups (-NO_2, -CN) INCREASE phenol acidity (especially at ortho and para positions), while electron donating groups (-CH_3) decrease acidity.</w:t>
+              <w:t>The reactive electrophilic intermediate in Reimer-Tiemann reaction is DICHLOROCARBENE (:CCl_2), an electron-deficient neutral species with 6 valence electrons.</w:t>
             </w:r>
           </w:p>
         </w:tc>
@@ -819,7 +952,7 @@
                 <w:color w:val="2D3748"/>
                 <w:sz w:val="19"/>
               </w:rPr>
-              <w:t>Reimer-Tiemann reaction involves dichlorocarbene (:CCl_2) as an electrophilic intermediate to convert phenol to salicylaldehyde.</w:t>
+              <w:t>Phenol reacts with bromine water to give a white precipitate of 2,4,6-tribromophenol; with neutral FeCl_3, it gives a characteristic violet coloration.</w:t>
             </w:r>
           </w:p>
         </w:tc>
@@ -836,6 +969,33 @@
           <w:sz w:val="19"/>
         </w:rPr>
         <w:t>Source PYQs testing this concept:</w:t>
+      </w:r>
+    </w:p>
+    <w:p>
+      <w:pPr>
+        <w:pStyle w:val="ListBullet"/>
+        <w:spacing w:after="40"/>
+      </w:pPr>
+      <w:r>
+        <w:rPr>
+          <w:b/>
+          <w:sz w:val="18"/>
+        </w:rPr>
+        <w:t xml:space="preserve">[2025 Shift] Q#2 (MCQ): </w:t>
+      </w:r>
+      <w:r>
+        <w:rPr>
+          <w:sz w:val="18"/>
+        </w:rPr>
+        <w:t xml:space="preserve">"Phenol can be distinguished from propanol by using the reagent..."  </w:t>
+      </w:r>
+      <w:r>
+        <w:rPr>
+          <w:b/>
+          <w:color w:val="2B6CB0"/>
+          <w:sz w:val="18"/>
+        </w:rPr>
+        <w:t>[Ans: N/A]</w:t>
       </w:r>
     </w:p>
     <w:p>
@@ -875,13 +1035,167 @@
           <w:b/>
           <w:sz w:val="18"/>
         </w:rPr>
-        <w:t xml:space="preserve">[2024 Shift] Q#1 (MCQ): </w:t>
+        <w:t xml:space="preserve">[2025 Shift] Q#4 (MCQ): </w:t>
       </w:r>
       <w:r>
         <w:rPr>
           <w:sz w:val="18"/>
         </w:rPr>
-        <w:t xml:space="preserve">"8.8 g of monohydric alcohol added to ethyl magnesium iodide in ether liberates 2240cm^3 of ethane at STP. This monohydric alcohol when o..."  </w:t>
+        <w:t xml:space="preserve">"AandBrespectively are..."  </w:t>
+      </w:r>
+      <w:r>
+        <w:rPr>
+          <w:b/>
+          <w:color w:val="2B6CB0"/>
+          <w:sz w:val="18"/>
+        </w:rPr>
+        <w:t>[Ans: N/A]</w:t>
+      </w:r>
+    </w:p>
+    <w:p>
+      <w:pPr>
+        <w:spacing w:after="120"/>
+      </w:pPr>
+    </w:p>
+    <w:p>
+      <w:pPr>
+        <w:pStyle w:val="Heading2"/>
+      </w:pPr>
+      <w:r>
+        <w:rPr>
+          <w:color w:val="2B6CB0"/>
+          <w:sz w:val="24"/>
+        </w:rPr>
+        <w:t>3.3 Alcohols: Preparation, Lucas Test &amp; Dehydration (Moderate Yield — 5 PYQs)</w:t>
+      </w:r>
+    </w:p>
+    <w:p>
+      <w:r>
+        <w:rPr>
+          <w:b/>
+          <w:sz w:val="20"/>
+        </w:rPr>
+        <w:t xml:space="preserve">Core Principle: </w:t>
+      </w:r>
+      <w:r>
+        <w:rPr>
+          <w:sz w:val="20"/>
+        </w:rPr>
+        <w:t>Lucas reagent (anhydrous ZnCl_2 + conc. HCl) distinguishes alcohols: 3° alcohol gives turbidity immediately; 2° alcohol gives turbidity in 5 minutes; 1° alcohol gives no turbidity at room temperature. Hydroboration-oxidation of alkenes gives anti-Markovnikov alcohol (without rearrangement). Acid-catalyzed dehydration of alcohols follows ease of carbocation: 3° &gt; 2° &gt; 1°.</w:t>
+      </w:r>
+    </w:p>
+    <w:tbl>
+      <w:tblPr>
+        <w:tblW w:type="auto" w:w="0"/>
+        <w:jc w:val="center"/>
+        <w:tblLook w:firstColumn="1" w:firstRow="1" w:lastColumn="0" w:lastRow="0" w:noHBand="0" w:noVBand="1" w:val="04A0"/>
+      </w:tblPr>
+      <w:tblGrid>
+        <w:gridCol w:w="10080"/>
+      </w:tblGrid>
+      <w:tr>
+        <w:tc>
+          <w:tcPr>
+            <w:tcW w:type="dxa" w:w="10080"/>
+            <w:shd w:fill="FFF5F5"/>
+            <w:tcMar>
+              <w:top w:w="100" w:type="dxa"/>
+              <w:bottom w:w="100" w:type="dxa"/>
+              <w:left w:w="150" w:type="dxa"/>
+              <w:right w:w="150" w:type="dxa"/>
+            </w:tcMar>
+          </w:tcPr>
+          <w:p>
+            <w:r>
+              <w:rPr>
+                <w:b/>
+                <w:color w:val="C53030"/>
+                <w:sz w:val="19"/>
+              </w:rPr>
+              <w:t xml:space="preserve">⚠️ Common Trap / JEE Pitfall: </w:t>
+            </w:r>
+            <w:r>
+              <w:rPr>
+                <w:color w:val="2D3748"/>
+                <w:sz w:val="19"/>
+              </w:rPr>
+              <w:t>Oxidation of 1° alcohol with PCC (pyridinium chlorochromate) yields an aldehyde; oxidation with acidified KMnO_4 oxidizes it all the way to carboxylic acid.</w:t>
+            </w:r>
+          </w:p>
+        </w:tc>
+      </w:tr>
+    </w:tbl>
+    <w:tbl>
+      <w:tblPr>
+        <w:tblW w:type="auto" w:w="0"/>
+        <w:jc w:val="center"/>
+        <w:tblLook w:firstColumn="1" w:firstRow="1" w:lastColumn="0" w:lastRow="0" w:noHBand="0" w:noVBand="1" w:val="04A0"/>
+      </w:tblPr>
+      <w:tblGrid>
+        <w:gridCol w:w="10080"/>
+      </w:tblGrid>
+      <w:tr>
+        <w:tc>
+          <w:tcPr>
+            <w:tcW w:type="dxa" w:w="10080"/>
+            <w:shd w:fill="F0FFF4"/>
+            <w:tcMar>
+              <w:top w:w="100" w:type="dxa"/>
+              <w:bottom w:w="100" w:type="dxa"/>
+              <w:left w:w="150" w:type="dxa"/>
+              <w:right w:w="150" w:type="dxa"/>
+            </w:tcMar>
+          </w:tcPr>
+          <w:p>
+            <w:r>
+              <w:rPr>
+                <w:b/>
+                <w:color w:val="276749"/>
+                <w:sz w:val="19"/>
+              </w:rPr>
+              <w:t xml:space="preserve">💡 Speed Hack / Trick: </w:t>
+            </w:r>
+            <w:r>
+              <w:rPr>
+                <w:color w:val="2D3748"/>
+                <w:sz w:val="19"/>
+              </w:rPr>
+              <w:t>Methanol is poisonous because it is oxidized in the liver to methanal (formaldehyde) and then formic acid, which causes blindness and metabolic acidosis.</w:t>
+            </w:r>
+          </w:p>
+        </w:tc>
+      </w:tr>
+    </w:tbl>
+    <w:p>
+      <w:pPr>
+        <w:spacing w:before="120" w:after="40"/>
+      </w:pPr>
+      <w:r>
+        <w:rPr>
+          <w:b/>
+          <w:color w:val="1A365D"/>
+          <w:sz w:val="19"/>
+        </w:rPr>
+        <w:t>Source PYQs testing this concept:</w:t>
+      </w:r>
+    </w:p>
+    <w:p>
+      <w:pPr>
+        <w:pStyle w:val="ListBullet"/>
+        <w:spacing w:after="40"/>
+      </w:pPr>
+      <w:r>
+        <w:rPr>
+          <w:b/>
+          <w:sz w:val="18"/>
+        </w:rPr>
+        <w:t xml:space="preserve">[2026 Shift] Q#3 (MCQ): </w:t>
+      </w:r>
+      <w:r>
+        <w:rPr>
+          <w:sz w:val="18"/>
+        </w:rPr>
+        <w:t xml:space="preserve">"R-CH_(2)OH is converted into R-CHO by reacting with ________...."  </w:t>
       </w:r>
       <w:r>
         <w:rPr>
@@ -902,13 +1216,40 @@
           <w:b/>
           <w:sz w:val="18"/>
         </w:rPr>
-        <w:t xml:space="preserve">[2023 Shift] Q#2 (MCQ): </w:t>
+        <w:t xml:space="preserve">[2026 Shift] Q#4 (MCQ): </w:t>
       </w:r>
       <w:r>
         <w:rPr>
           <w:sz w:val="18"/>
         </w:rPr>
-        <w:t xml:space="preserve">"Y in the above reaction is..."  </w:t>
+        <w:t xml:space="preserve">"$\text{C}_{3}\text{H}_{6}\overset{(i)\text{BH}_{3};(ii)\text{H}_{2}\text{O}_{2}/\text{NaOH}}{\rightarrow \le ftarrow}P\overset{\text{CrO}_{3..."  </w:t>
+      </w:r>
+      <w:r>
+        <w:rPr>
+          <w:b/>
+          <w:color w:val="2B6CB0"/>
+          <w:sz w:val="18"/>
+        </w:rPr>
+        <w:t>[Ans: N/A]</w:t>
+      </w:r>
+    </w:p>
+    <w:p>
+      <w:pPr>
+        <w:pStyle w:val="ListBullet"/>
+        <w:spacing w:after="40"/>
+      </w:pPr>
+      <w:r>
+        <w:rPr>
+          <w:b/>
+          <w:sz w:val="18"/>
+        </w:rPr>
+        <w:t xml:space="preserve">[2024 Shift] Q#2 (MCQ): </w:t>
+      </w:r>
+      <w:r>
+        <w:rPr>
+          <w:sz w:val="18"/>
+        </w:rPr>
+        <w:t xml:space="preserve">"When a tertiary alcohol ' A^'(C_(4)H_(10)O) reacts with 20%H_(3)PO_(4) at 358 K , it gives a compound ' B^'(C_(4)H_(8)) as a major..."  </w:t>
       </w:r>
       <w:r>
         <w:rPr>
@@ -1067,7 +1408,7 @@
           <w:color w:val="1A365D"/>
           <w:sz w:val="22"/>
         </w:rPr>
-        <w:t>Benchmark Problem 2: KCET 2024 (Q#1)</w:t>
+        <w:t>Benchmark Problem 2: KCET 2026 (Q#3)</w:t>
       </w:r>
     </w:p>
     <w:p>
@@ -1078,7 +1419,7 @@
         <w:rPr>
           <w:sz w:val="20"/>
         </w:rPr>
-        <w:t>8.8 g of monohydric alcohol added to ethyl magnesium iodide in ether liberates 2240cm^3 of ethane at STP. This monohydric alcohol when oxidised using pyridinium-chloro-chromate, forms a carbonyl compound that answers silver mirror test (Tollen's test). The monohydric alcohol is</w:t>
+        <w:t>R-CH_(2)OH is converted into R-CHO by reacting with ________.</w:t>
       </w:r>
     </w:p>
     <w:p>
@@ -1090,7 +1431,7 @@
         <w:rPr>
           <w:sz w:val="19"/>
         </w:rPr>
-        <w:t>(A) butan-2-ol</w:t>
+        <w:t>(A) Alkaline KMnO_(4)</w:t>
       </w:r>
     </w:p>
     <w:p>
@@ -1102,7 +1443,7 @@
         <w:rPr>
           <w:sz w:val="19"/>
         </w:rPr>
-        <w:t>(B) 2,2-dimethyl propan-1-ol</w:t>
+        <w:t>(B) LiAlH_(4)</w:t>
       </w:r>
     </w:p>
     <w:p>
@@ -1114,7 +1455,7 @@
         <w:rPr>
           <w:sz w:val="19"/>
         </w:rPr>
-        <w:t>(C) pentan-2-ol</w:t>
+        <w:t>(C) Na/C_(2)H_(5)OH</w:t>
       </w:r>
     </w:p>
     <w:p>
@@ -1126,7 +1467,7 @@
         <w:rPr>
           <w:sz w:val="19"/>
         </w:rPr>
-        <w:t>(D) 2, 2-dimethyl ethan-1-ol</w:t>
+        <w:t>(D) PCC (Pyridinium Chlorochromate)</w:t>
       </w:r>
     </w:p>
     <w:tbl>
@@ -1167,11 +1508,128 @@
               </w:rPr>
               <w:t>Solution Analysis:</w:t>
               <w:br/>
-              <w:t>Given that, 8.8 g of monohydric alcohol liberates 2240cm^3 of ethane.</w:t>
+              <w:t>R-CH_(2)OH is a primary alcohol. To convert a primary alcohol into an aldehyde, we need a mild oxidising agent. PCC oxidises primary alcohols to aldehydes without further oxidising them to carboxylic acids. R-CH_(2)OHvec(→ ≤ ftarrow)R-CHO Alkaline KMnO_(4) is a strong oxidising agent, so it usually oxidises primary alcohols further to carboxylic acids: R-CH_(2)OH\oversetalkalineKMnO_(4)→ ≤ ftarrowR-COOH LiAlH_(4) and Na/C_(2)H_(5)OH are reducing agents, so they are not used for this oxidation. So the correct answer is: Option D: PCC (Pyridinium Chlorochromate)</w:t>
+            </w:r>
+          </w:p>
+        </w:tc>
+      </w:tr>
+    </w:tbl>
+    <w:p>
+      <w:pPr>
+        <w:spacing w:after="120"/>
+      </w:pPr>
+    </w:p>
+    <w:p>
+      <w:pPr>
+        <w:spacing w:before="160" w:after="40"/>
+      </w:pPr>
+      <w:r>
+        <w:rPr>
+          <w:b/>
+          <w:color w:val="1A365D"/>
+          <w:sz w:val="22"/>
+        </w:rPr>
+        <w:t>Benchmark Problem 3: KCET 2021 (Q#4)</w:t>
+      </w:r>
+    </w:p>
+    <w:p>
+      <w:pPr>
+        <w:spacing w:after="80"/>
+      </w:pPr>
+      <w:r>
+        <w:rPr>
+          <w:sz w:val="20"/>
+        </w:rPr>
+        <w:t>A compound ^'A^'(C_(7)H_(8)O) is insoluble in NaHCO_(3) solution but dissolve in NaOH and give a characteristic colour with neutral FeCl_(3) solution. When treated with bromine water compound ' A ' forms the compound B with the formula C_(7)H_(5)OBr_(3) . ' A ' is</w:t>
+      </w:r>
+    </w:p>
+    <w:p>
+      <w:pPr>
+        <w:pStyle w:val="ListBullet"/>
+        <w:spacing w:after="20"/>
+      </w:pPr>
+      <w:r>
+        <w:rPr>
+          <w:sz w:val="19"/>
+        </w:rPr>
+        <w:t xml:space="preserve">(A) </w:t>
+      </w:r>
+    </w:p>
+    <w:p>
+      <w:pPr>
+        <w:pStyle w:val="ListBullet"/>
+        <w:spacing w:after="20"/>
+      </w:pPr>
+      <w:r>
+        <w:rPr>
+          <w:sz w:val="19"/>
+        </w:rPr>
+        <w:t xml:space="preserve">(B) </w:t>
+      </w:r>
+    </w:p>
+    <w:p>
+      <w:pPr>
+        <w:pStyle w:val="ListBullet"/>
+        <w:spacing w:after="20"/>
+      </w:pPr>
+      <w:r>
+        <w:rPr>
+          <w:sz w:val="19"/>
+        </w:rPr>
+        <w:t xml:space="preserve">(C) </w:t>
+      </w:r>
+    </w:p>
+    <w:p>
+      <w:pPr>
+        <w:pStyle w:val="ListBullet"/>
+        <w:spacing w:after="20"/>
+      </w:pPr>
+      <w:r>
+        <w:rPr>
+          <w:sz w:val="19"/>
+        </w:rPr>
+        <w:t xml:space="preserve">(D) </w:t>
+      </w:r>
+    </w:p>
+    <w:tbl>
+      <w:tblPr>
+        <w:tblW w:type="auto" w:w="0"/>
+        <w:jc w:val="center"/>
+        <w:tblLook w:firstColumn="1" w:firstRow="1" w:lastColumn="0" w:lastRow="0" w:noHBand="0" w:noVBand="1" w:val="04A0"/>
+      </w:tblPr>
+      <w:tblGrid>
+        <w:gridCol w:w="10080"/>
+      </w:tblGrid>
+      <w:tr>
+        <w:tc>
+          <w:tcPr>
+            <w:tcW w:type="dxa" w:w="10080"/>
+            <w:shd w:fill="F7FAFC"/>
+            <w:tcMar>
+              <w:top w:w="100" w:type="dxa"/>
+              <w:bottom w:w="100" w:type="dxa"/>
+              <w:left w:w="150" w:type="dxa"/>
+              <w:right w:w="150" w:type="dxa"/>
+            </w:tcMar>
+          </w:tcPr>
+          <w:p>
+            <w:r>
+              <w:rPr>
+                <w:b/>
+                <w:color w:val="1A365D"/>
+                <w:sz w:val="19"/>
+              </w:rPr>
+              <w:t>Correct Answer: None</w:t>
               <w:br/>
-              <w:t>So, 88 g of monohydric alcohol will liberate 22400cm^3 (STP)</w:t>
+            </w:r>
+            <w:r>
+              <w:rPr>
+                <w:color w:val="2D3748"/>
+                <w:sz w:val="18"/>
+              </w:rPr>
+              <w:t>Solution Analysis:</w:t>
               <w:br/>
-              <w:t>Now, the carbonyl compound that can oxidise Tollens reagent is aldehyde and it is the oxidising product of 1° alcohol. So, among the given options 2, 2-dimethyl propan-1-ol (molecular mass =88 ) is the required monohydric alcohol.</w:t>
+              <w:t>It is given in the question that, compound A gives a characteristic colour with neutral FeCl_(3) solution and soluble in NaOH solution that means it contains a phenolic group. Since compound ' A ' when treated with Br_(2) forms compound ' B ' with molecular formula C_(7)H_(5)OBr_(3) (ppt.). Considering the given information the given compound is most likely to be m -cresol. i.e. Thus, the overall reactions are as follows.</w:t>
             </w:r>
           </w:p>
         </w:tc>

</xml_diff>